<commit_message>
Rework cover page: full-page illustration background, watermark removed, light text on navy panels
Co-Authored-By: Claude Sonnet 5.5 <noreply@anthropic.com>
Claude-Session: https://claude.ai/code/session_015VjzBvuo6BhinPbnAvZyJn
</commit_message>
<xml_diff>
--- a/Yillik_yoqlama_varogi_yuz_qismi.docx
+++ b/Yillik_yoqlama_varogi_yuz_qismi.docx
@@ -4,62 +4,37 @@
   <w:body>
     <w:p>
       <w:pPr>
-        <w:spacing w:after="40" w:before="0"/>
+        <w:spacing w:after="80" w:before="0"/>
         <w:jc w:val="center"/>
       </w:pPr>
       <w:r>
         <w:rPr>
           <w:b/>
-          <w:color w:val="0E2A66"/>
-          <w:sz w:val="88"/>
+          <w:color w:val="FFFFFF"/>
+          <w:sz w:val="84"/>
         </w:rPr>
         <w:t>YILLIK YO'QLAMA VARAG'I</w:t>
       </w:r>
-    </w:p>
-    <w:p>
-      <w:pPr>
-        <w:spacing w:after="40" w:before="0"/>
-        <w:jc w:val="center"/>
-      </w:pPr>
-      <w:r>
-        <w:rPr>
-          <w:b/>
-          <w:sz w:val="60"/>
-        </w:rPr>
-        <w:t>«IT dasturchi 2-26» guruhi</w:t>
-      </w:r>
-    </w:p>
-    <w:p>
-      <w:pPr>
-        <w:spacing w:after="160" w:before="0"/>
-        <w:jc w:val="center"/>
-      </w:pPr>
-      <w:r>
-        <w:rPr>
-          <w:b w:val="0"/>
-          <w:sz w:val="36"/>
-        </w:rPr>
-        <w:t>2026–2027 o'quv yili</w:t>
-      </w:r>
-    </w:p>
-    <w:p>
-      <w:pPr>
-        <w:spacing w:after="200"/>
-        <w:jc w:val="center"/>
-      </w:pPr>
       <w:r>
         <w:drawing>
-          <wp:inline xmlns:a="http://schemas.openxmlformats.org/drawingml/2006/main" xmlns:pic="http://schemas.openxmlformats.org/drawingml/2006/picture">
-            <wp:extent cx="7740000" cy="3698000"/>
-            <wp:docPr id="1" name="Picture 1"/>
-            <wp:cNvGraphicFramePr>
-              <a:graphicFrameLocks noChangeAspect="1"/>
-            </wp:cNvGraphicFramePr>
-            <a:graphic>
+          <wp:anchor distT="0" distB="0" distL="0" distR="0" simplePos="0" relativeHeight="0" behindDoc="1" locked="0" layoutInCell="1" allowOverlap="1">
+            <wp:simplePos x="0" y="0"/>
+            <wp:positionH relativeFrom="page">
+              <wp:posOffset>0</wp:posOffset>
+            </wp:positionH>
+            <wp:positionV relativeFrom="page">
+              <wp:posOffset>0</wp:posOffset>
+            </wp:positionV>
+            <wp:extent cx="10692000" cy="7560000"/>
+            <wp:effectExtent l="0" t="0" r="0" b="0"/>
+            <wp:wrapNone/>
+            <wp:docPr id="1" name="Fon rasmi" descr="IT dasturchi ish joyi"/>
+            <wp:cNvGraphicFramePr/>
+            <a:graphic xmlns:a="http://schemas.openxmlformats.org/drawingml/2006/main" xmlns:pic="http://schemas.openxmlformats.org/drawingml/2006/picture">
               <a:graphicData uri="http://schemas.openxmlformats.org/drawingml/2006/picture">
                 <pic:pic>
                   <pic:nvPicPr>
-                    <pic:cNvPr id="0" name="cover_art.png"/>
+                    <pic:cNvPr id="0" name="cover_bg.png"/>
                     <pic:cNvPicPr/>
                   </pic:nvPicPr>
                   <pic:blipFill>
@@ -71,61 +46,142 @@
                   <pic:spPr>
                     <a:xfrm>
                       <a:off x="0" y="0"/>
-                      <a:ext cx="7740000" cy="3698000"/>
+                      <a:ext cx="10692000" cy="7560000"/>
                     </a:xfrm>
                     <a:prstGeom prst="rect"/>
                   </pic:spPr>
                 </pic:pic>
               </a:graphicData>
             </a:graphic>
-          </wp:inline>
+          </wp:anchor>
         </w:drawing>
       </w:r>
     </w:p>
     <w:p>
       <w:pPr>
-        <w:tabs>
-          <w:tab w:pos="3855" w:val="left"/>
-          <w:tab w:pos="12756" w:val="left" w:leader="underscore"/>
-        </w:tabs>
-        <w:spacing w:before="200"/>
-        <w:ind w:left="1417"/>
+        <w:spacing w:after="40" w:before="0"/>
+        <w:jc w:val="center"/>
       </w:pPr>
       <w:r>
         <w:rPr>
           <w:b/>
-          <w:sz w:val="32"/>
+          <w:color w:val="FFFFFF"/>
+          <w:sz w:val="60"/>
         </w:rPr>
-        <w:t>Guruh rahbari:</w:t>
-      </w:r>
-      <w:r>
-        <w:tab/>
-        <w:tab/>
+        <w:t>«IT dasturchi 2-26» guruhi</w:t>
       </w:r>
     </w:p>
     <w:p>
       <w:pPr>
         <w:spacing w:after="0" w:before="0"/>
-        <w:ind w:left="3855" w:right="1814"/>
         <w:jc w:val="center"/>
       </w:pPr>
       <w:r>
         <w:rPr>
           <w:b w:val="0"/>
-          <w:sz w:val="22"/>
+          <w:color w:val="D6E8F7"/>
+          <w:sz w:val="36"/>
         </w:rPr>
-        <w:t>(ism, familiyasi, imzo)</w:t>
+        <w:t>2026–2027 o'quv yili</w:t>
       </w:r>
+    </w:p>
+    <w:tbl>
+      <w:tblPr>
+        <w:tblpPr w:leftFromText="0" w:rightFromText="0" w:vertAnchor="page" w:horzAnchor="page" w:tblpX="2381" w:tblpY="10460"/>
+        <w:tblW w:type="auto" w:w="0"/>
+        <w:tblLayout w:type="fixed"/>
+        <w:tblLook w:firstColumn="1" w:firstRow="1" w:lastColumn="0" w:lastRow="0" w:noHBand="0" w:noVBand="1" w:val="04A0"/>
+      </w:tblPr>
+      <w:tblGrid>
+        <w:gridCol w:w="2948"/>
+        <w:gridCol w:w="8561"/>
+      </w:tblGrid>
+      <w:tr>
+        <w:trPr>
+          <w:trHeight w:val="567"/>
+          <w:trHeight w:val="567" w:hRule="atLeast"/>
+        </w:trPr>
+        <w:tc>
+          <w:tcPr>
+            <w:tcW w:type="dxa" w:w="2948"/>
+            <w:vAlign w:val="bottom"/>
+          </w:tcPr>
+          <w:p>
+            <w:pPr>
+              <w:spacing w:after="0"/>
+            </w:pPr>
+            <w:r/>
+            <w:r>
+              <w:rPr>
+                <w:b/>
+                <w:color w:val="FFFFFF"/>
+                <w:sz w:val="36"/>
+              </w:rPr>
+              <w:t>Guruh rahbari:</w:t>
+            </w:r>
+          </w:p>
+        </w:tc>
+        <w:tc>
+          <w:tcPr>
+            <w:tcW w:type="dxa" w:w="8561"/>
+            <w:tcBorders>
+              <w:bottom w:val="single" w:sz="12" w:space="0" w:color="FFFFFF"/>
+            </w:tcBorders>
+            <w:vAlign w:val="bottom"/>
+          </w:tcPr>
+          <w:p>
+            <w:pPr>
+              <w:spacing w:after="0"/>
+              <w:jc w:val="center"/>
+              <w:rPr>
+                <w:color w:val="FFFFFF"/>
+                <w:sz w:val="32"/>
+                <w:szCs w:val="32"/>
+              </w:rPr>
+            </w:pPr>
+          </w:p>
+        </w:tc>
+      </w:tr>
+      <w:tr>
+        <w:tc>
+          <w:tcPr>
+            <w:tcW w:type="dxa" w:w="2948"/>
+          </w:tcPr>
+          <w:p>
+            <w:r/>
+          </w:p>
+        </w:tc>
+        <w:tc>
+          <w:tcPr>
+            <w:tcW w:type="dxa" w:w="8561"/>
+          </w:tcPr>
+          <w:p>
+            <w:pPr>
+              <w:jc w:val="center"/>
+            </w:pPr>
+            <w:r/>
+            <w:r>
+              <w:rPr>
+                <w:color w:val="D6E8F7"/>
+                <w:sz w:val="24"/>
+              </w:rPr>
+              <w:t>(ism, familiyasi, imzo)</w:t>
+            </w:r>
+          </w:p>
+        </w:tc>
+      </w:tr>
+    </w:tbl>
+    <w:p>
+      <w:pPr>
+        <w:spacing w:after="0"/>
+        <w:rPr>
+          <w:sz w:val="2"/>
+        </w:rPr>
+      </w:pPr>
     </w:p>
     <w:sectPr>
       <w:pgSz w:w="16838" w:h="11906" w:orient="landscape"/>
-      <w:pgMar w:top="850" w:right="1134" w:bottom="680" w:left="1134" w:header="720" w:footer="720" w:gutter="0"/>
-      <w:pgBorders w:offsetFrom="page">
-        <w:top w:val="double" w:sz="18" w:space="24" w:color="0E2A66"/>
-        <w:left w:val="double" w:sz="18" w:space="24" w:color="0E2A66"/>
-        <w:bottom w:val="double" w:sz="18" w:space="24" w:color="0E2A66"/>
-        <w:right w:val="double" w:sz="18" w:space="24" w:color="0E2A66"/>
-      </w:pgBorders>
+      <w:pgMar w:top="680" w:right="1134" w:bottom="283" w:left="1134" w:header="720" w:footer="720" w:gutter="0"/>
       <w:cols w:space="720"/>
       <w:docGrid w:linePitch="360"/>
     </w:sectPr>

</xml_diff>

<commit_message>
Attendance register: remove signature row, new cover title, left binding margin
Co-Authored-By: Claude Sonnet 5.5 <noreply@anthropic.com>
Claude-Session: https://claude.ai/code/session_015VjzBvuo6BhinPbnAvZyJn
</commit_message>
<xml_diff>
--- a/Yillik_yoqlama_varogi_yuz_qismi.docx
+++ b/Yillik_yoqlama_varogi_yuz_qismi.docx
@@ -11,9 +11,9 @@
         <w:rPr>
           <w:b/>
           <w:color w:val="FFFFFF"/>
-          <w:sz w:val="84"/>
+          <w:sz w:val="72"/>
         </w:rPr>
-        <w:t>YILLIK YO'QLAMA VARAG'I</w:t>
+        <w:t>O'QUVCHILAR YILLIK YO'QLAMASI</w:t>
       </w:r>
       <w:r>
         <w:drawing>
@@ -165,7 +165,7 @@
                 <w:color w:val="D6E8F7"/>
                 <w:sz w:val="24"/>
               </w:rPr>
-              <w:t>(ism, familiyasi, imzo)</w:t>
+              <w:t>(ism, familiyasi)</w:t>
             </w:r>
           </w:p>
         </w:tc>

</xml_diff>